<commit_message>
Create reproducible Nature Health project
Consolidate local input data, reader-facing preparation and analyses, and
the manuscript into one Quarto render workflow. Preserve the verified renv
baseline and startup scan fixes, central reduced-bootstrap settings, and
automated editable Word output.

Include the manuscript, bibliography, navigation and display revisions.
Track the rendered website, preprocessing RDS files and result exports;
exclude regenerated analysis RDS objects and model compilation products.
Document the reproduction commands, file-size policy and expected runtimes.
Remove superseded production materials and the H06 daily analysis.

Validation: independent full reproduction comparisons, synchronized renv,
HTML/Word manuscript rendering, reproduction-page rendering, local website
links, and complete tracking of website assets with no files above 100 MiB.
</commit_message>
<xml_diff>
--- a/assets/reference.docx
+++ b/assets/reference.docx
@@ -7953,10 +7953,12 @@
     <w:qFormat/>
     <w:rsid w:val="00132CBB"/>
     <w:pPr>
-      <w:spacing w:before="36" w:after="36"/>
+      <w:spacing w:before="0" w:after="40" w:line="240" w:lineRule="auto"/>
     </w:pPr>
     <w:rPr>
       <w:rFonts w:eastAsiaTheme="minorHAnsi" w:cstheme="minorBidi"/>
+      <w:sz w:val="18"/>
+      <w:szCs w:val="18"/>
     </w:rPr>
   </w:style>
   <w:style w:type="paragraph" w:styleId="Funotentext">

</xml_diff>